<commit_message>
Audit report: accented notes in the Partially table
Co-Authored-By: Claude Sonnet 5 <noreply@anthropic.com>
</commit_message>
<xml_diff>
--- a/docs/BAO_CAO_COMPILER_AUDIT.docx
+++ b/docs/BAO_CAO_COMPILER_AUDIT.docx
@@ -1267,7 +1267,7 @@
               <w:rPr>
                 <w:sz w:val="19"/>
               </w:rPr>
-              <w:t>REMOVE tui nilon/tui den/ghe khong duoc yeu cau</w:t>
+              <w:t>Thêm REMOVE túi nilon, túi đen, ghế không được yêu cầu</w:t>
             </w:r>
           </w:p>
         </w:tc>
@@ -1311,7 +1311,7 @@
               <w:rPr>
                 <w:sz w:val="19"/>
               </w:rPr>
-              <w:t>mo ta sai anh goc: nguoi truot van (skateboard), khong phai scooter</w:t>
+              <w:t>Mô tả sai ảnh gốc: người trượt ván (skateboard), không phải scooter</w:t>
             </w:r>
           </w:p>
         </w:tc>
@@ -1355,7 +1355,7 @@
               <w:rPr>
                 <w:sz w:val="19"/>
               </w:rPr>
-              <w:t>ADD "one pink umbrella"/REMOVE cac o hong: suy dien ngoai cau lenh</w:t>
+              <w:t>ADD "one pink umbrella" và REMOVE các ô hồng: suy diễn ngoài câu lệnh</w:t>
             </w:r>
           </w:p>
         </w:tc>
@@ -1399,7 +1399,7 @@
               <w:rPr>
                 <w:sz w:val="19"/>
               </w:rPr>
-              <w:t>1 atom gop 2 thay doi (phong cach + mau dao bep), khong don nguyen tu; "island trang" suy dien</w:t>
+              <w:t>Một atom gộp hai thay đổi (phong cách + màu đảo bếp), không đơn nguyên tử; "đảo trắng" là suy diễn</w:t>
             </w:r>
           </w:p>
         </w:tc>
@@ -1443,7 +1443,7 @@
               <w:rPr>
                 <w:sz w:val="19"/>
               </w:rPr>
-              <w:t>REPLACE stationary-&gt;stopped du thua/trung lap</w:t>
+              <w:t>REPLACE stationary -&gt; stopped dư thừa, trùng lặp</w:t>
             </w:r>
           </w:p>
         </w:tc>
@@ -1487,7 +1487,7 @@
               <w:rPr>
                 <w:sz w:val="19"/>
               </w:rPr>
-              <w:t>REPLACE grassy field-&gt;sky sai: dung ra la ADD sky</w:t>
+              <w:t>REPLACE grassy field -&gt; sky sai: đúng ra là ADD sky</w:t>
             </w:r>
           </w:p>
         </w:tc>
@@ -1531,7 +1531,7 @@
               <w:rPr>
                 <w:sz w:val="19"/>
               </w:rPr>
-              <w:t>source "two lights" khong khop anh (chi thay 1 den)</w:t>
+              <w:t>Source "two lights" không khớp ảnh (chỉ thấy 1 đèn)</w:t>
             </w:r>
           </w:p>
         </w:tc>
@@ -1575,7 +1575,7 @@
               <w:rPr>
                 <w:sz w:val="19"/>
               </w:rPr>
-              <w:t>REMOVE umbrella khong duoc yeu cau</w:t>
+              <w:t>REMOVE umbrella không được yêu cầu</w:t>
             </w:r>
           </w:p>
         </w:tc>
@@ -1619,7 +1619,7 @@
               <w:rPr>
                 <w:sz w:val="19"/>
               </w:rPr>
-              <w:t>ADD table + ADD lamp + REPLACE trung lap nhau</w:t>
+              <w:t>ADD table + ADD lamp + REPLACE trùng lặp nhau</w:t>
             </w:r>
           </w:p>
         </w:tc>
@@ -1663,7 +1663,7 @@
               <w:rPr>
                 <w:sz w:val="19"/>
               </w:rPr>
-              <w:t>cau lenh mo ho; REPLACE "seen from the back-&gt;visible from the screen" khong ro nghia</w:t>
+              <w:t>Câu lệnh mơ hồ; REPLACE "seen from the back -&gt; visible from the screen" không rõ nghĩa</w:t>
             </w:r>
           </w:p>
         </w:tc>
@@ -1707,7 +1707,7 @@
               <w:rPr>
                 <w:sz w:val="19"/>
               </w:rPr>
-              <w:t>mo ta ca vat "patterned yellow tie" khong khop (ca vat xanh olive/hong)</w:t>
+              <w:t>Mô tả cà vạt "patterned yellow tie" không khớp (cà vạt xanh olive/hồng)</w:t>
             </w:r>
           </w:p>
         </w:tc>
@@ -1751,7 +1751,7 @@
               <w:rPr>
                 <w:sz w:val="19"/>
               </w:rPr>
-              <w:t>"four urinals" va "white and beige" khong khop anh (thay ~3 bon)</w:t>
+              <w:t>"four urinals" và "white and beige" không khớp ảnh (thấy khoảng 3 bồn)</w:t>
             </w:r>
           </w:p>
         </w:tc>
@@ -1795,7 +1795,7 @@
               <w:rPr>
                 <w:sz w:val="19"/>
               </w:rPr>
-              <w:t>ADD baby + REPLACE holding toothbrush-&gt;holding baby: trung lap</w:t>
+              <w:t>ADD baby + REPLACE holding toothbrush -&gt; holding baby: trùng lặp</w:t>
             </w:r>
           </w:p>
         </w:tc>

</xml_diff>